<commit_message>
docs(plan): v1.1 -- re-auditoria honesta (corrige fases + reancla en adopcion/conversion)
Nueva §0.5: tras auditar el codigo real, Fase 0-1 estan SHIPPED (CRM Vivo, handoff,
lift), Fase 2 parcial (inversion expuesta, vision), Fase 3 andamiada (kit AuraReal).
El cuello de botella no es construir features -> es adopcion/conversion (1 sesion real,
40 activos demo, 0 leads de corredor). Re-ancla el norte en MAKLO + trafico real.
Nota al §3 apuntando a §0.5. Reconocimiento del sobre-scope inicial.

Co-Authored-By: Claude Opus 4.8 <noreply@anthropic.com>
</commit_message>
<xml_diff>
--- a/docs/PLAN_Producto_6meses_2026-07.docx
+++ b/docs/PLAN_Producto_6meses_2026-07.docx
@@ -44,7 +44,16 @@
         <w:t>Estado:</w:t>
       </w:r>
       <w:r>
-        <w:t xml:space="preserve"> v1.0, borrador para red-team del fundador</w:t>
+        <w:t xml:space="preserve"> v1.1 — </w:t>
+      </w:r>
+      <w:r>
+        <w:rPr>
+          <w:b/>
+        </w:rPr>
+        <w:t>RE-AUDITADO 2026-07-24</w:t>
+      </w:r>
+      <w:r>
+        <w:t xml:space="preserve"> (ver §0.5, que corrige y re-ancla); borrador para red-team del fundador</w:t>
       </w:r>
     </w:p>
     <w:p>
@@ -95,6 +104,461 @@
       </w:r>
       <w:r>
         <w:t xml:space="preserve"> (lift de intención + handoffs calificados). No "más features": *evidencia del negocio*.</w:t>
+      </w:r>
+    </w:p>
+    <w:p>
+      <w:pPr>
+        <w:pStyle w:val="Heading1"/>
+      </w:pPr>
+      <w:r>
+        <w:t>0.5 · RE-AUDITORÍA (2026-07-24) — corrección honesta de scope</w:t>
+      </w:r>
+    </w:p>
+    <w:p>
+      <w:pPr>
+        <w:pStyle w:val="IntenseQuote"/>
+      </w:pPr>
+      <w:r>
+        <w:t xml:space="preserve">Tras auditar el </w:t>
+      </w:r>
+      <w:r>
+        <w:rPr>
+          <w:b/>
+        </w:rPr>
+        <w:t>código real</w:t>
+      </w:r>
+      <w:r>
+        <w:t xml:space="preserve"> (no el NORTHSTAR desactualizado), este plan estaba </w:t>
+      </w:r>
+      <w:r>
+        <w:rPr>
+          <w:b/>
+        </w:rPr>
+        <w:t>sobre-dimensionado en construcción.</w:t>
+      </w:r>
+      <w:r>
+        <w:t xml:space="preserve"> La mayoría de las "fases a construir" </w:t>
+      </w:r>
+      <w:r>
+        <w:rPr>
+          <w:b/>
+        </w:rPr>
+        <w:t>ya está construida.</w:t>
+      </w:r>
+      <w:r>
+        <w:t xml:space="preserve"> Esta sección corrige y re-ancla; el cuerpo de abajo se conserva como el razonamiento original, superado en scope por esto. *Reconocimiento honesto: no audité a fondo la superficie CRM/lift antes de escribir el plan — este es el correctivo.*</w:t>
+      </w:r>
+    </w:p>
+    <w:p>
+      <w:r>
+        <w:rPr>
+          <w:b/>
+        </w:rPr>
+        <w:t>Lo que ya está construido (verificado en código, no en el NORTHSTAR):</w:t>
+      </w:r>
+    </w:p>
+    <w:p>
+      <w:pPr>
+        <w:pStyle w:val="ListBullet"/>
+      </w:pPr>
+      <w:r>
+        <w:rPr>
+          <w:b/>
+        </w:rPr>
+        <w:t>Fase 0 (instrumentar):</w:t>
+      </w:r>
+      <w:r>
+        <w:t xml:space="preserve"> había cómputo en vivo (</w:t>
+      </w:r>
+      <w:r>
+        <w:rPr>
+          <w:rFonts w:ascii="Consolas" w:hAnsi="Consolas"/>
+          <w:color w:val="1F6FEB"/>
+          <w:sz w:val="19"/>
+        </w:rPr>
+        <w:t>intencion_de_sesion</w:t>
+      </w:r>
+      <w:r>
+        <w:t>) + ahora persistencia (</w:t>
+      </w:r>
+      <w:r>
+        <w:rPr>
+          <w:rFonts w:ascii="Consolas" w:hAnsi="Consolas"/>
+          <w:color w:val="1F6FEB"/>
+          <w:sz w:val="19"/>
+        </w:rPr>
+        <w:t>intencion_sesion</w:t>
+      </w:r>
+      <w:r>
+        <w:t xml:space="preserve"> / </w:t>
+      </w:r>
+      <w:r>
+        <w:rPr>
+          <w:rFonts w:ascii="Consolas" w:hAnsi="Consolas"/>
+          <w:color w:val="1F6FEB"/>
+          <w:sz w:val="19"/>
+        </w:rPr>
+        <w:t>intencion_evento</w:t>
+      </w:r>
+      <w:r>
+        <w:t xml:space="preserve">) + el lift lee el recorrido (Part A). </w:t>
+      </w:r>
+      <w:r>
+        <w:rPr>
+          <w:b/>
+        </w:rPr>
+        <w:t>Hecho y en prod, probado con sesión real.</w:t>
+      </w:r>
+    </w:p>
+    <w:p>
+      <w:pPr>
+        <w:pStyle w:val="ListBullet"/>
+      </w:pPr>
+      <w:r>
+        <w:rPr>
+          <w:b/>
+        </w:rPr>
+        <w:t>Fase 1 (CRM Vivo + handoff + lift):</w:t>
+      </w:r>
+      <w:r>
+        <w:t xml:space="preserve"> ✅ </w:t>
+      </w:r>
+      <w:r>
+        <w:rPr>
+          <w:b/>
+        </w:rPr>
+        <w:t>SHIPPED.</w:t>
+      </w:r>
+      <w:r>
+        <w:t xml:space="preserve"> Panel de leads (</w:t>
+      </w:r>
+      <w:r>
+        <w:rPr>
+          <w:rFonts w:ascii="Consolas" w:hAnsi="Consolas"/>
+          <w:color w:val="1F6FEB"/>
+          <w:sz w:val="19"/>
+        </w:rPr>
+        <w:t>LeadsPanel.jsx</w:t>
+      </w:r>
+      <w:r>
+        <w:t xml:space="preserve"> + </w:t>
+      </w:r>
+      <w:r>
+        <w:rPr>
+          <w:rFonts w:ascii="Consolas" w:hAnsi="Consolas"/>
+          <w:color w:val="1F6FEB"/>
+          <w:sz w:val="19"/>
+        </w:rPr>
+        <w:t>/assets/{id}/leads</w:t>
+      </w:r>
+      <w:r>
+        <w:t xml:space="preserve">), funnel, handoff al pico, chat in-platform, y </w:t>
+      </w:r>
+      <w:r>
+        <w:rPr>
+          <w:rFonts w:ascii="Consolas" w:hAnsi="Consolas"/>
+          <w:color w:val="1F6FEB"/>
+          <w:sz w:val="19"/>
+        </w:rPr>
+        <w:t>/assets/metricas/lift</w:t>
+      </w:r>
+      <w:r>
+        <w:t xml:space="preserve"> con disciplina anti-vanity.</w:t>
+      </w:r>
+    </w:p>
+    <w:p>
+      <w:pPr>
+        <w:pStyle w:val="ListBullet"/>
+      </w:pPr>
+      <w:r>
+        <w:rPr>
+          <w:b/>
+        </w:rPr>
+        <w:t>Fase 2 (auditoría del comprador):</w:t>
+      </w:r>
+      <w:r>
+        <w:t xml:space="preserve"> 🔨 </w:t>
+      </w:r>
+      <w:r>
+        <w:rPr>
+          <w:b/>
+        </w:rPr>
+        <w:t>parcial, más de lo esperado</w:t>
+      </w:r>
+      <w:r>
+        <w:t xml:space="preserve"> — capa de inversión expuesta (</w:t>
+      </w:r>
+      <w:r>
+        <w:rPr>
+          <w:rFonts w:ascii="Consolas" w:hAnsi="Consolas"/>
+          <w:color w:val="1F6FEB"/>
+          <w:sz w:val="19"/>
+        </w:rPr>
+        <w:t>GET /{id}/investment</w:t>
+      </w:r>
+      <w:r>
+        <w:t>), visión/ficha técnica, entorno/habitabilidad/estilo-de-vida.</w:t>
+      </w:r>
+    </w:p>
+    <w:p>
+      <w:pPr>
+        <w:pStyle w:val="ListBullet"/>
+      </w:pPr>
+      <w:r>
+        <w:rPr>
+          <w:b/>
+        </w:rPr>
+        <w:t>Fase 3 (storefront / Canal):</w:t>
+      </w:r>
+      <w:r>
+        <w:t xml:space="preserve"> 🔨 kit AuraReal completo en </w:t>
+      </w:r>
+      <w:r>
+        <w:rPr>
+          <w:rFonts w:ascii="Consolas" w:hAnsi="Consolas"/>
+          <w:color w:val="1F6FEB"/>
+          <w:sz w:val="19"/>
+        </w:rPr>
+        <w:t>lanzamiento-pyme/</w:t>
+      </w:r>
+      <w:r>
+        <w:t>; Canal de Aura en su Fase 0 (canal fantasma).</w:t>
+      </w:r>
+    </w:p>
+    <w:p>
+      <w:r>
+        <w:rPr>
+          <w:b/>
+        </w:rPr>
+        <w:t>Los gaps REALES (pequeños, de código — hacer cuando el uso lo pida):</w:t>
+      </w:r>
+    </w:p>
+    <w:p>
+      <w:pPr>
+        <w:pStyle w:val="ListNumber"/>
+      </w:pPr>
+      <w:r>
+        <w:rPr>
+          <w:b/>
+        </w:rPr>
+        <w:t>Atribución por origen</w:t>
+      </w:r>
+      <w:r>
+        <w:t xml:space="preserve"> (orgánico-habitante vs campaña-pagada) — el muro de leads del Canal §8. No construido.</w:t>
+      </w:r>
+    </w:p>
+    <w:p>
+      <w:pPr>
+        <w:pStyle w:val="ListNumber"/>
+      </w:pPr>
+      <w:r>
+        <w:rPr>
+          <w:b/>
+        </w:rPr>
+        <w:t>Legal Parser</w:t>
+      </w:r>
+      <w:r>
+        <w:t xml:space="preserve"> (escrituras/predial → alertas) — el pilar legal de la auditoría Habivio. No confirmado como construido.</w:t>
+      </w:r>
+    </w:p>
+    <w:p>
+      <w:pPr>
+        <w:pStyle w:val="ListNumber"/>
+      </w:pPr>
+      <w:r>
+        <w:rPr>
+          <w:b/>
+        </w:rPr>
+        <w:t>OKF / capa citable</w:t>
+      </w:r>
+      <w:r>
+        <w:t xml:space="preserve"> (Fase 4) — planificado, futuro.</w:t>
+      </w:r>
+    </w:p>
+    <w:p>
+      <w:r>
+        <w:rPr>
+          <w:b/>
+        </w:rPr>
+        <w:t>El reencuadre que gobierna los próximos 6 meses:</w:t>
+      </w:r>
+    </w:p>
+    <w:p>
+      <w:pPr>
+        <w:pStyle w:val="IntenseQuote"/>
+      </w:pPr>
+      <w:r>
+        <w:rPr>
+          <w:b/>
+        </w:rPr>
+        <w:t>El cuello de botella NO es construir features — es adopción y conversión.</w:t>
+      </w:r>
+    </w:p>
+    <w:p>
+      <w:r>
+        <w:t xml:space="preserve">Evidencia dura en el propio repo: </w:t>
+      </w:r>
+      <w:r>
+        <w:rPr>
+          <w:rFonts w:ascii="Consolas" w:hAnsi="Consolas"/>
+          <w:color w:val="1F6FEB"/>
+          <w:sz w:val="19"/>
+        </w:rPr>
+        <w:t>intencion_evento</w:t>
+      </w:r>
+      <w:r>
+        <w:t xml:space="preserve"> = </w:t>
+      </w:r>
+      <w:r>
+        <w:rPr>
+          <w:b/>
+        </w:rPr>
+        <w:t>1 sesión</w:t>
+      </w:r>
+      <w:r>
+        <w:t xml:space="preserve"> (un test); </w:t>
+      </w:r>
+      <w:r>
+        <w:rPr>
+          <w:rFonts w:ascii="Consolas" w:hAnsi="Consolas"/>
+          <w:color w:val="1F6FEB"/>
+          <w:sz w:val="19"/>
+        </w:rPr>
+        <w:t>activos_inmutables</w:t>
+      </w:r>
+      <w:r>
+        <w:t xml:space="preserve"> = </w:t>
+      </w:r>
+      <w:r>
+        <w:rPr>
+          <w:b/>
+        </w:rPr>
+        <w:t>40 demo</w:t>
+      </w:r>
+      <w:r>
+        <w:t xml:space="preserve">; </w:t>
+      </w:r>
+      <w:r>
+        <w:rPr>
+          <w:b/>
+        </w:rPr>
+        <w:t>0 leads de corredor real.</w:t>
+      </w:r>
+      <w:r>
+        <w:t xml:space="preserve"> La máquina está construida y </w:t>
+      </w:r>
+      <w:r>
+        <w:rPr>
+          <w:b/>
+        </w:rPr>
+        <w:t>ociosa</w:t>
+      </w:r>
+      <w:r>
+        <w:t xml:space="preserve"> — el riesgo </w:t>
+      </w:r>
+      <w:r>
+        <w:rPr>
+          <w:b/>
+        </w:rPr>
+        <w:t>88%-pilotea / 5%-cosecha</w:t>
+      </w:r>
+      <w:r>
+        <w:t xml:space="preserve"> del </w:t>
+      </w:r>
+      <w:r>
+        <w:rPr>
+          <w:rFonts w:ascii="Consolas" w:hAnsi="Consolas"/>
+          <w:color w:val="1F6FEB"/>
+          <w:sz w:val="19"/>
+        </w:rPr>
+        <w:t>ESTUDIO_Adopcion_IA_Real_Estate</w:t>
+      </w:r>
+      <w:r>
+        <w:t>, hecho realidad aquí.</w:t>
+      </w:r>
+    </w:p>
+    <w:p>
+      <w:r>
+        <w:rPr>
+          <w:b/>
+        </w:rPr>
+        <w:t>El plan re-anclado (norte real):</w:t>
+      </w:r>
+    </w:p>
+    <w:p>
+      <w:pPr>
+        <w:pStyle w:val="ListNumber"/>
+      </w:pPr>
+      <w:r>
+        <w:rPr>
+          <w:b/>
+        </w:rPr>
+        <w:t>MAKLO / inventario real</w:t>
+      </w:r>
+      <w:r>
+        <w:t xml:space="preserve"> (mesa 29-jul-2026): inventario verificado real + su storefront → los primeros QR reales. *El combustible de todo.*</w:t>
+      </w:r>
+    </w:p>
+    <w:p>
+      <w:pPr>
+        <w:pStyle w:val="ListNumber"/>
+      </w:pPr>
+      <w:r>
+        <w:rPr>
+          <w:b/>
+        </w:rPr>
+        <w:t>Onboarding de 1-2 corredores reales</w:t>
+      </w:r>
+      <w:r>
+        <w:t xml:space="preserve"> usando el panel CRM Vivo con SUS leads (no demo).</w:t>
+      </w:r>
+    </w:p>
+    <w:p>
+      <w:pPr>
+        <w:pStyle w:val="ListNumber"/>
+      </w:pPr>
+      <w:r>
+        <w:rPr>
+          <w:b/>
+        </w:rPr>
+        <w:t>Medir el lift con dato real</w:t>
+      </w:r>
+      <w:r>
+        <w:t xml:space="preserve"> — la máquina ya está lista (Fase 0 + Part A); solo falta el tráfico.</w:t>
+      </w:r>
+    </w:p>
+    <w:p>
+      <w:pPr>
+        <w:pStyle w:val="ListNumber"/>
+      </w:pPr>
+      <w:r>
+        <w:rPr>
+          <w:b/>
+        </w:rPr>
+        <w:t>Los gaps de código chicos</w:t>
+      </w:r>
+      <w:r>
+        <w:t xml:space="preserve"> (atribución, Legal Parser) se hacen </w:t>
+      </w:r>
+      <w:r>
+        <w:rPr>
+          <w:b/>
+        </w:rPr>
+        <w:t>cuando el uso los pida</w:t>
+      </w:r>
+      <w:r>
+        <w:t>, no antes.</w:t>
+      </w:r>
+    </w:p>
+    <w:p>
+      <w:r>
+        <w:rPr>
+          <w:b/>
+        </w:rPr>
+        <w:t>En una línea:</w:t>
+      </w:r>
+      <w:r>
+        <w:t xml:space="preserve"> de *"¿qué construimos?"* → *"¿cómo logramos que 20 compradores-habitante reales y 1 corredor real toquen esto en Quito este mes?"* — porque el producto ya está; lo que falta es la demanda que lo valide.</w:t>
       </w:r>
     </w:p>
     <w:p>
@@ -1103,6 +1567,41 @@
     </w:p>
     <w:p>
       <w:pPr>
+        <w:pStyle w:val="IntenseQuote"/>
+      </w:pPr>
+      <w:r>
+        <w:t xml:space="preserve">⚠️ </w:t>
+      </w:r>
+      <w:r>
+        <w:rPr>
+          <w:b/>
+        </w:rPr>
+        <w:t>Corregido por la re-auditoría (§0.5):</w:t>
+      </w:r>
+      <w:r>
+        <w:t xml:space="preserve"> la mayoría de estas fases </w:t>
+      </w:r>
+      <w:r>
+        <w:rPr>
+          <w:b/>
+        </w:rPr>
+        <w:t>ya está construida</w:t>
+      </w:r>
+      <w:r>
+        <w:t xml:space="preserve"> (Fase 0-1 shipped, 2 parcial, 3 andamiado). Lo de abajo se conserva como el razonamiento original; el </w:t>
+      </w:r>
+      <w:r>
+        <w:rPr>
+          <w:b/>
+        </w:rPr>
+        <w:t>norte operativo real es §0.5</w:t>
+      </w:r>
+      <w:r>
+        <w:t xml:space="preserve"> (MAKLO + tráfico real, no re-construir).</w:t>
+      </w:r>
+    </w:p>
+    <w:p>
+      <w:pPr>
         <w:pStyle w:val="Heading2"/>
       </w:pPr>
       <w:r>

</xml_diff>